<commit_message>
Ajustados hallazgos en DU y DI
</commit_message>
<xml_diff>
--- a/fuentes/CFA01 - 86120367_DU.docx
+++ b/fuentes/CFA01 - 86120367_DU.docx
@@ -210,7 +210,7 @@
               </wp:anchor>
             </w:drawing>
           </mc:Choice>
-          <mc:Fallback xmlns:a14="http://schemas.microsoft.com/office/drawing/2010/main" xmlns:pic="http://schemas.openxmlformats.org/drawingml/2006/picture" xmlns:adec="http://schemas.microsoft.com/office/drawing/2017/decorative" xmlns:a="http://schemas.openxmlformats.org/drawingml/2006/main">
+          <mc:Fallback xmlns:a="http://schemas.openxmlformats.org/drawingml/2006/main" xmlns:adec="http://schemas.microsoft.com/office/drawing/2017/decorative" xmlns:pic="http://schemas.openxmlformats.org/drawingml/2006/picture" xmlns:a14="http://schemas.microsoft.com/office/drawing/2010/main">
             <w:pict w14:anchorId="75509E97">
               <v:rect id="Rectángulo 3" style="position:absolute;margin-left:-55.7pt;margin-top:26.5pt;width:613.85pt;height:204pt;z-index:-251655168;visibility:visible;mso-wrap-style:square;mso-height-percent:0;mso-wrap-distance-left:9pt;mso-wrap-distance-top:0;mso-wrap-distance-right:9pt;mso-wrap-distance-bottom:0;mso-position-horizontal:absolute;mso-position-horizontal-relative:text;mso-position-vertical:absolute;mso-position-vertical-relative:text;mso-height-percent:0;mso-height-relative:margin;v-text-anchor:middle" alt="&quot;&quot;" o:spid="_x0000_s1026" fillcolor="#00314d" stroked="f" strokeweight="1pt" w14:anchorId="04BF2410" o:gfxdata="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"/>
             </w:pict>
@@ -587,7 +587,7 @@
           <w:r>
             <w:fldChar w:fldCharType="separate"/>
           </w:r>
-          <w:hyperlink w:anchor="_Toc201851607" w:history="1">
+          <w:hyperlink w:anchor="_Toc202852126" w:history="1">
             <w:r>
               <w:rPr>
                 <w:rStyle w:val="Hipervnculo"/>
@@ -614,7 +614,7 @@
                 <w:noProof/>
                 <w:webHidden/>
               </w:rPr>
-              <w:instrText xml:space="preserve"> PAGEREF _Toc201851607 \h </w:instrText>
+              <w:instrText xml:space="preserve"> PAGEREF _Toc202852126 \h </w:instrText>
             </w:r>
             <w:r>
               <w:rPr>
@@ -660,7 +660,7 @@
               <w:lang w:eastAsia="es-MX"/>
             </w:rPr>
           </w:pPr>
-          <w:hyperlink w:anchor="_Toc201851608" w:history="1">
+          <w:hyperlink w:anchor="_Toc202852127" w:history="1">
             <w:r>
               <w:rPr>
                 <w:rStyle w:val="Hipervnculo"/>
@@ -704,7 +704,7 @@
                 <w:noProof/>
                 <w:webHidden/>
               </w:rPr>
-              <w:instrText xml:space="preserve"> PAGEREF _Toc201851608 \h </w:instrText>
+              <w:instrText xml:space="preserve"> PAGEREF _Toc202852127 \h </w:instrText>
             </w:r>
             <w:r>
               <w:rPr>
@@ -737,11 +737,7 @@
         </w:p>
         <w:p>
           <w:pPr>
-            <w:pStyle w:val="TDC1"/>
-            <w:tabs>
-              <w:tab w:val="left" w:pos="1440"/>
-              <w:tab w:val="right" w:leader="dot" w:pos="9962"/>
-            </w:tabs>
+            <w:pStyle w:val="TDC2"/>
             <w:rPr>
               <w:rFonts w:eastAsiaTheme="minorEastAsia"/>
               <w:noProof/>
@@ -750,40 +746,23 @@
               <w:lang w:eastAsia="es-MX"/>
             </w:rPr>
           </w:pPr>
-          <w:hyperlink w:anchor="_Toc201851609" w:history="1">
+          <w:hyperlink w:anchor="_Toc202852128" w:history="1">
             <w:r>
               <w:rPr>
                 <w:rStyle w:val="Hipervnculo"/>
                 <w:noProof/>
               </w:rPr>
-              <w:t>1.1.</w:t>
-            </w:r>
-            <w:r>
-              <w:rPr>
-                <w:rFonts w:eastAsiaTheme="minorEastAsia"/>
-                <w:noProof/>
-                <w:sz w:val="24"/>
-                <w:szCs w:val="24"/>
-                <w:lang w:eastAsia="es-MX"/>
+              <w:t>1.1 Definición y función del bloque de cilindros</w:t>
+            </w:r>
+            <w:r>
+              <w:rPr>
+                <w:noProof/>
+                <w:webHidden/>
               </w:rPr>
               <w:tab/>
             </w:r>
             <w:r>
               <w:rPr>
-                <w:rStyle w:val="Hipervnculo"/>
-                <w:noProof/>
-              </w:rPr>
-              <w:t>Definición y función del bloque de cilindros</w:t>
-            </w:r>
-            <w:r>
-              <w:rPr>
-                <w:noProof/>
-                <w:webHidden/>
-              </w:rPr>
-              <w:tab/>
-            </w:r>
-            <w:r>
-              <w:rPr>
                 <w:noProof/>
                 <w:webHidden/>
               </w:rPr>
@@ -794,7 +773,7 @@
                 <w:noProof/>
                 <w:webHidden/>
               </w:rPr>
-              <w:instrText xml:space="preserve"> PAGEREF _Toc201851609 \h </w:instrText>
+              <w:instrText xml:space="preserve"> PAGEREF _Toc202852128 \h </w:instrText>
             </w:r>
             <w:r>
               <w:rPr>
@@ -827,11 +806,7 @@
         </w:p>
         <w:p>
           <w:pPr>
-            <w:pStyle w:val="TDC1"/>
-            <w:tabs>
-              <w:tab w:val="left" w:pos="1440"/>
-              <w:tab w:val="right" w:leader="dot" w:pos="9962"/>
-            </w:tabs>
+            <w:pStyle w:val="TDC2"/>
             <w:rPr>
               <w:rFonts w:eastAsiaTheme="minorEastAsia"/>
               <w:noProof/>
@@ -840,48 +815,23 @@
               <w:lang w:eastAsia="es-MX"/>
             </w:rPr>
           </w:pPr>
-          <w:hyperlink w:anchor="_Toc201851610" w:history="1">
+          <w:hyperlink w:anchor="_Toc202852129" w:history="1">
             <w:r>
               <w:rPr>
                 <w:rStyle w:val="Hipervnculo"/>
                 <w:noProof/>
               </w:rPr>
-              <w:t>1.2.</w:t>
-            </w:r>
-            <w:r>
-              <w:rPr>
-                <w:rFonts w:eastAsiaTheme="minorEastAsia"/>
-                <w:noProof/>
-                <w:sz w:val="24"/>
-                <w:szCs w:val="24"/>
-                <w:lang w:eastAsia="es-MX"/>
+              <w:t>1.2 Materiales y construcción del bloque de cilindros</w:t>
+            </w:r>
+            <w:r>
+              <w:rPr>
+                <w:noProof/>
+                <w:webHidden/>
               </w:rPr>
               <w:tab/>
             </w:r>
             <w:r>
               <w:rPr>
-                <w:rStyle w:val="Hipervnculo"/>
-                <w:rFonts w:eastAsiaTheme="majorEastAsia" w:cstheme="majorBidi"/>
-                <w:noProof/>
-              </w:rPr>
-              <w:t>Materiales</w:t>
-            </w:r>
-            <w:r>
-              <w:rPr>
-                <w:rStyle w:val="Hipervnculo"/>
-                <w:noProof/>
-              </w:rPr>
-              <w:t xml:space="preserve"> y construcción del bloque de cilindros</w:t>
-            </w:r>
-            <w:r>
-              <w:rPr>
-                <w:noProof/>
-                <w:webHidden/>
-              </w:rPr>
-              <w:tab/>
-            </w:r>
-            <w:r>
-              <w:rPr>
                 <w:noProof/>
                 <w:webHidden/>
               </w:rPr>
@@ -892,7 +842,7 @@
                 <w:noProof/>
                 <w:webHidden/>
               </w:rPr>
-              <w:instrText xml:space="preserve"> PAGEREF _Toc201851610 \h </w:instrText>
+              <w:instrText xml:space="preserve"> PAGEREF _Toc202852129 \h </w:instrText>
             </w:r>
             <w:r>
               <w:rPr>
@@ -925,11 +875,7 @@
         </w:p>
         <w:p>
           <w:pPr>
-            <w:pStyle w:val="TDC1"/>
-            <w:tabs>
-              <w:tab w:val="left" w:pos="1440"/>
-              <w:tab w:val="right" w:leader="dot" w:pos="9962"/>
-            </w:tabs>
+            <w:pStyle w:val="TDC2"/>
             <w:rPr>
               <w:rFonts w:eastAsiaTheme="minorEastAsia"/>
               <w:noProof/>
@@ -938,48 +884,23 @@
               <w:lang w:eastAsia="es-MX"/>
             </w:rPr>
           </w:pPr>
-          <w:hyperlink w:anchor="_Toc201851611" w:history="1">
+          <w:hyperlink w:anchor="_Toc202852130" w:history="1">
             <w:r>
               <w:rPr>
                 <w:rStyle w:val="Hipervnculo"/>
                 <w:noProof/>
               </w:rPr>
-              <w:t>1.3.</w:t>
-            </w:r>
-            <w:r>
-              <w:rPr>
-                <w:rFonts w:eastAsiaTheme="minorEastAsia"/>
-                <w:noProof/>
-                <w:sz w:val="24"/>
-                <w:szCs w:val="24"/>
-                <w:lang w:eastAsia="es-MX"/>
+              <w:t>1.3 Fallas comunes en el bloque de cilindros y su diagnóstico</w:t>
+            </w:r>
+            <w:r>
+              <w:rPr>
+                <w:noProof/>
+                <w:webHidden/>
               </w:rPr>
               <w:tab/>
             </w:r>
             <w:r>
               <w:rPr>
-                <w:rStyle w:val="Hipervnculo"/>
-                <w:rFonts w:eastAsiaTheme="majorEastAsia" w:cstheme="majorBidi"/>
-                <w:noProof/>
-              </w:rPr>
-              <w:t>Fallas</w:t>
-            </w:r>
-            <w:r>
-              <w:rPr>
-                <w:rStyle w:val="Hipervnculo"/>
-                <w:noProof/>
-              </w:rPr>
-              <w:t xml:space="preserve"> comunes en el bloque de cilindros y su diagnóstico</w:t>
-            </w:r>
-            <w:r>
-              <w:rPr>
-                <w:noProof/>
-                <w:webHidden/>
-              </w:rPr>
-              <w:tab/>
-            </w:r>
-            <w:r>
-              <w:rPr>
                 <w:noProof/>
                 <w:webHidden/>
               </w:rPr>
@@ -990,7 +911,7 @@
                 <w:noProof/>
                 <w:webHidden/>
               </w:rPr>
-              <w:instrText xml:space="preserve"> PAGEREF _Toc201851611 \h </w:instrText>
+              <w:instrText xml:space="preserve"> PAGEREF _Toc202852130 \h </w:instrText>
             </w:r>
             <w:r>
               <w:rPr>
@@ -1036,7 +957,7 @@
               <w:lang w:eastAsia="es-MX"/>
             </w:rPr>
           </w:pPr>
-          <w:hyperlink w:anchor="_Toc201851612" w:history="1">
+          <w:hyperlink w:anchor="_Toc202852131" w:history="1">
             <w:r>
               <w:rPr>
                 <w:rStyle w:val="Hipervnculo"/>
@@ -1080,7 +1001,7 @@
                 <w:noProof/>
                 <w:webHidden/>
               </w:rPr>
-              <w:instrText xml:space="preserve"> PAGEREF _Toc201851612 \h </w:instrText>
+              <w:instrText xml:space="preserve"> PAGEREF _Toc202852131 \h </w:instrText>
             </w:r>
             <w:r>
               <w:rPr>
@@ -1122,7 +1043,7 @@
               <w:lang w:eastAsia="es-MX"/>
             </w:rPr>
           </w:pPr>
-          <w:hyperlink w:anchor="_Toc201851613" w:history="1">
+          <w:hyperlink w:anchor="_Toc202852132" w:history="1">
             <w:r>
               <w:rPr>
                 <w:rStyle w:val="Hipervnculo"/>
@@ -1143,7 +1064,7 @@
                 <w:rStyle w:val="Hipervnculo"/>
                 <w:noProof/>
               </w:rPr>
-              <w:t xml:space="preserve"> Tipos de camisas de cilindro.</w:t>
+              <w:t xml:space="preserve"> Tipos de camisas de cilindro</w:t>
             </w:r>
             <w:r>
               <w:rPr>
@@ -1164,7 +1085,7 @@
                 <w:noProof/>
                 <w:webHidden/>
               </w:rPr>
-              <w:instrText xml:space="preserve"> PAGEREF _Toc201851613 \h </w:instrText>
+              <w:instrText xml:space="preserve"> PAGEREF _Toc202852132 \h </w:instrText>
             </w:r>
             <w:r>
               <w:rPr>
@@ -1209,7 +1130,7 @@
               <w:lang w:eastAsia="es-MX"/>
             </w:rPr>
           </w:pPr>
-          <w:hyperlink w:anchor="_Toc201851614" w:history="1">
+          <w:hyperlink w:anchor="_Toc202852133" w:history="1">
             <w:r>
               <w:rPr>
                 <w:rStyle w:val="Hipervnculo"/>
@@ -1236,7 +1157,7 @@
                 <w:noProof/>
                 <w:webHidden/>
               </w:rPr>
-              <w:instrText xml:space="preserve"> PAGEREF _Toc201851614 \h </w:instrText>
+              <w:instrText xml:space="preserve"> PAGEREF _Toc202852133 \h </w:instrText>
             </w:r>
             <w:r>
               <w:rPr>
@@ -1281,13 +1202,13 @@
               <w:lang w:eastAsia="es-MX"/>
             </w:rPr>
           </w:pPr>
-          <w:hyperlink w:anchor="_Toc201851615" w:history="1">
+          <w:hyperlink w:anchor="_Toc202852134" w:history="1">
             <w:r>
               <w:rPr>
                 <w:rStyle w:val="Hipervnculo"/>
                 <w:noProof/>
               </w:rPr>
-              <w:t>2.1.2. Camisas húmedas: ventajas y desventajas</w:t>
+              <w:t>2.1.2. Camisas húmedas: características y aplicaciones</w:t>
             </w:r>
             <w:r>
               <w:rPr>
@@ -1308,7 +1229,7 @@
                 <w:noProof/>
                 <w:webHidden/>
               </w:rPr>
-              <w:instrText xml:space="preserve"> PAGEREF _Toc201851615 \h </w:instrText>
+              <w:instrText xml:space="preserve"> PAGEREF _Toc202852134 \h </w:instrText>
             </w:r>
             <w:r>
               <w:rPr>
@@ -1350,7 +1271,7 @@
               <w:lang w:eastAsia="es-MX"/>
             </w:rPr>
           </w:pPr>
-          <w:hyperlink w:anchor="_Toc201851616" w:history="1">
+          <w:hyperlink w:anchor="_Toc202852135" w:history="1">
             <w:r>
               <w:rPr>
                 <w:rStyle w:val="Hipervnculo"/>
@@ -1377,7 +1298,7 @@
                 <w:noProof/>
                 <w:webHidden/>
               </w:rPr>
-              <w:instrText xml:space="preserve"> PAGEREF _Toc201851616 \h </w:instrText>
+              <w:instrText xml:space="preserve"> PAGEREF _Toc202852135 \h </w:instrText>
             </w:r>
             <w:r>
               <w:rPr>
@@ -1423,7 +1344,7 @@
               <w:lang w:eastAsia="es-MX"/>
             </w:rPr>
           </w:pPr>
-          <w:hyperlink w:anchor="_Toc201851617" w:history="1">
+          <w:hyperlink w:anchor="_Toc202852136" w:history="1">
             <w:r>
               <w:rPr>
                 <w:rStyle w:val="Hipervnculo"/>
@@ -1467,7 +1388,7 @@
                 <w:noProof/>
                 <w:webHidden/>
               </w:rPr>
-              <w:instrText xml:space="preserve"> PAGEREF _Toc201851617 \h </w:instrText>
+              <w:instrText xml:space="preserve"> PAGEREF _Toc202852136 \h </w:instrText>
             </w:r>
             <w:r>
               <w:rPr>
@@ -1509,7 +1430,7 @@
               <w:lang w:eastAsia="es-MX"/>
             </w:rPr>
           </w:pPr>
-          <w:hyperlink w:anchor="_Toc201851618" w:history="1">
+          <w:hyperlink w:anchor="_Toc202852137" w:history="1">
             <w:r>
               <w:rPr>
                 <w:rStyle w:val="Hipervnculo"/>
@@ -1536,7 +1457,7 @@
                 <w:noProof/>
                 <w:webHidden/>
               </w:rPr>
-              <w:instrText xml:space="preserve"> PAGEREF _Toc201851618 \h </w:instrText>
+              <w:instrText xml:space="preserve"> PAGEREF _Toc202852137 \h </w:instrText>
             </w:r>
             <w:r>
               <w:rPr>
@@ -1578,7 +1499,7 @@
               <w:lang w:eastAsia="es-MX"/>
             </w:rPr>
           </w:pPr>
-          <w:hyperlink w:anchor="_Toc201851619" w:history="1">
+          <w:hyperlink w:anchor="_Toc202852138" w:history="1">
             <w:r>
               <w:rPr>
                 <w:rStyle w:val="Hipervnculo"/>
@@ -1605,7 +1526,7 @@
                 <w:noProof/>
                 <w:webHidden/>
               </w:rPr>
-              <w:instrText xml:space="preserve"> PAGEREF _Toc201851619 \h </w:instrText>
+              <w:instrText xml:space="preserve"> PAGEREF _Toc202852138 \h </w:instrText>
             </w:r>
             <w:r>
               <w:rPr>
@@ -1647,7 +1568,7 @@
               <w:lang w:eastAsia="es-MX"/>
             </w:rPr>
           </w:pPr>
-          <w:hyperlink w:anchor="_Toc201851620" w:history="1">
+          <w:hyperlink w:anchor="_Toc202852139" w:history="1">
             <w:r>
               <w:rPr>
                 <w:rStyle w:val="Hipervnculo"/>
@@ -1674,7 +1595,7 @@
                 <w:noProof/>
                 <w:webHidden/>
               </w:rPr>
-              <w:instrText xml:space="preserve"> PAGEREF _Toc201851620 \h </w:instrText>
+              <w:instrText xml:space="preserve"> PAGEREF _Toc202852139 \h </w:instrText>
             </w:r>
             <w:r>
               <w:rPr>
@@ -1719,7 +1640,7 @@
               <w:lang w:eastAsia="es-MX"/>
             </w:rPr>
           </w:pPr>
-          <w:hyperlink w:anchor="_Toc201851621" w:history="1">
+          <w:hyperlink w:anchor="_Toc202852140" w:history="1">
             <w:r>
               <w:rPr>
                 <w:rStyle w:val="Hipervnculo"/>
@@ -1746,7 +1667,7 @@
                 <w:noProof/>
                 <w:webHidden/>
               </w:rPr>
-              <w:instrText xml:space="preserve"> PAGEREF _Toc201851621 \h </w:instrText>
+              <w:instrText xml:space="preserve"> PAGEREF _Toc202852140 \h </w:instrText>
             </w:r>
             <w:r>
               <w:rPr>
@@ -1791,7 +1712,7 @@
               <w:lang w:eastAsia="es-MX"/>
             </w:rPr>
           </w:pPr>
-          <w:hyperlink w:anchor="_Toc201851622" w:history="1">
+          <w:hyperlink w:anchor="_Toc202852141" w:history="1">
             <w:r>
               <w:rPr>
                 <w:rStyle w:val="Hipervnculo"/>
@@ -1818,7 +1739,7 @@
                 <w:noProof/>
                 <w:webHidden/>
               </w:rPr>
-              <w:instrText xml:space="preserve"> PAGEREF _Toc201851622 \h </w:instrText>
+              <w:instrText xml:space="preserve"> PAGEREF _Toc202852141 \h </w:instrText>
             </w:r>
             <w:r>
               <w:rPr>
@@ -1863,7 +1784,7 @@
               <w:lang w:eastAsia="es-MX"/>
             </w:rPr>
           </w:pPr>
-          <w:hyperlink w:anchor="_Toc201851623" w:history="1">
+          <w:hyperlink w:anchor="_Toc202852142" w:history="1">
             <w:r>
               <w:rPr>
                 <w:rStyle w:val="Hipervnculo"/>
@@ -1890,7 +1811,7 @@
                 <w:noProof/>
                 <w:webHidden/>
               </w:rPr>
-              <w:instrText xml:space="preserve"> PAGEREF _Toc201851623 \h </w:instrText>
+              <w:instrText xml:space="preserve"> PAGEREF _Toc202852142 \h </w:instrText>
             </w:r>
             <w:r>
               <w:rPr>
@@ -1936,7 +1857,7 @@
               <w:lang w:eastAsia="es-MX"/>
             </w:rPr>
           </w:pPr>
-          <w:hyperlink w:anchor="_Toc201851624" w:history="1">
+          <w:hyperlink w:anchor="_Toc202852143" w:history="1">
             <w:r>
               <w:rPr>
                 <w:rStyle w:val="Hipervnculo"/>
@@ -1984,7 +1905,7 @@
                 <w:noProof/>
                 <w:webHidden/>
               </w:rPr>
-              <w:instrText xml:space="preserve"> PAGEREF _Toc201851624 \h </w:instrText>
+              <w:instrText xml:space="preserve"> PAGEREF _Toc202852143 \h </w:instrText>
             </w:r>
             <w:r>
               <w:rPr>
@@ -2026,7 +1947,7 @@
               <w:lang w:eastAsia="es-MX"/>
             </w:rPr>
           </w:pPr>
-          <w:hyperlink w:anchor="_Toc201851625" w:history="1">
+          <w:hyperlink w:anchor="_Toc202852144" w:history="1">
             <w:r>
               <w:rPr>
                 <w:rStyle w:val="Hipervnculo"/>
@@ -2061,7 +1982,7 @@
                 <w:noProof/>
                 <w:webHidden/>
               </w:rPr>
-              <w:instrText xml:space="preserve"> PAGEREF _Toc201851625 \h </w:instrText>
+              <w:instrText xml:space="preserve"> PAGEREF _Toc202852144 \h </w:instrText>
             </w:r>
             <w:r>
               <w:rPr>
@@ -2103,7 +2024,7 @@
               <w:lang w:eastAsia="es-MX"/>
             </w:rPr>
           </w:pPr>
-          <w:hyperlink w:anchor="_Toc201851626" w:history="1">
+          <w:hyperlink w:anchor="_Toc202852145" w:history="1">
             <w:r>
               <w:rPr>
                 <w:rStyle w:val="Hipervnculo"/>
@@ -2130,7 +2051,7 @@
                 <w:noProof/>
                 <w:webHidden/>
               </w:rPr>
-              <w:instrText xml:space="preserve"> PAGEREF _Toc201851626 \h </w:instrText>
+              <w:instrText xml:space="preserve"> PAGEREF _Toc202852145 \h </w:instrText>
             </w:r>
             <w:r>
               <w:rPr>
@@ -2172,7 +2093,7 @@
               <w:lang w:eastAsia="es-MX"/>
             </w:rPr>
           </w:pPr>
-          <w:hyperlink w:anchor="_Toc201851627" w:history="1">
+          <w:hyperlink w:anchor="_Toc202852146" w:history="1">
             <w:r>
               <w:rPr>
                 <w:rStyle w:val="Hipervnculo"/>
@@ -2199,7 +2120,7 @@
                 <w:noProof/>
                 <w:webHidden/>
               </w:rPr>
-              <w:instrText xml:space="preserve"> PAGEREF _Toc201851627 \h </w:instrText>
+              <w:instrText xml:space="preserve"> PAGEREF _Toc202852146 \h </w:instrText>
             </w:r>
             <w:r>
               <w:rPr>
@@ -2241,7 +2162,7 @@
               <w:lang w:eastAsia="es-MX"/>
             </w:rPr>
           </w:pPr>
-          <w:hyperlink w:anchor="_Toc201851628" w:history="1">
+          <w:hyperlink w:anchor="_Toc202852147" w:history="1">
             <w:r>
               <w:rPr>
                 <w:rStyle w:val="Hipervnculo"/>
@@ -2268,7 +2189,7 @@
                 <w:noProof/>
                 <w:webHidden/>
               </w:rPr>
-              <w:instrText xml:space="preserve"> PAGEREF _Toc201851628 \h </w:instrText>
+              <w:instrText xml:space="preserve"> PAGEREF _Toc202852147 \h </w:instrText>
             </w:r>
             <w:r>
               <w:rPr>
@@ -2314,7 +2235,7 @@
               <w:lang w:eastAsia="es-MX"/>
             </w:rPr>
           </w:pPr>
-          <w:hyperlink w:anchor="_Toc201851629" w:history="1">
+          <w:hyperlink w:anchor="_Toc202852148" w:history="1">
             <w:r>
               <w:rPr>
                 <w:rStyle w:val="Hipervnculo"/>
@@ -2362,7 +2283,7 @@
                 <w:noProof/>
                 <w:webHidden/>
               </w:rPr>
-              <w:instrText xml:space="preserve"> PAGEREF _Toc201851629 \h </w:instrText>
+              <w:instrText xml:space="preserve"> PAGEREF _Toc202852148 \h </w:instrText>
             </w:r>
             <w:r>
               <w:rPr>
@@ -2404,7 +2325,7 @@
               <w:lang w:eastAsia="es-MX"/>
             </w:rPr>
           </w:pPr>
-          <w:hyperlink w:anchor="_Toc201851630" w:history="1">
+          <w:hyperlink w:anchor="_Toc202852149" w:history="1">
             <w:r>
               <w:rPr>
                 <w:rStyle w:val="Hipervnculo"/>
@@ -2431,7 +2352,7 @@
                 <w:noProof/>
                 <w:webHidden/>
               </w:rPr>
-              <w:instrText xml:space="preserve"> PAGEREF _Toc201851630 \h </w:instrText>
+              <w:instrText xml:space="preserve"> PAGEREF _Toc202852149 \h </w:instrText>
             </w:r>
             <w:r>
               <w:rPr>
@@ -2473,7 +2394,7 @@
               <w:lang w:eastAsia="es-MX"/>
             </w:rPr>
           </w:pPr>
-          <w:hyperlink w:anchor="_Toc201851631" w:history="1">
+          <w:hyperlink w:anchor="_Toc202852150" w:history="1">
             <w:r>
               <w:rPr>
                 <w:rStyle w:val="Hipervnculo"/>
@@ -2500,7 +2421,7 @@
                 <w:noProof/>
                 <w:webHidden/>
               </w:rPr>
-              <w:instrText xml:space="preserve"> PAGEREF _Toc201851631 \h </w:instrText>
+              <w:instrText xml:space="preserve"> PAGEREF _Toc202852150 \h </w:instrText>
             </w:r>
             <w:r>
               <w:rPr>
@@ -2542,7 +2463,7 @@
               <w:lang w:eastAsia="es-MX"/>
             </w:rPr>
           </w:pPr>
-          <w:hyperlink w:anchor="_Toc201851632" w:history="1">
+          <w:hyperlink w:anchor="_Toc202852151" w:history="1">
             <w:r>
               <w:rPr>
                 <w:rStyle w:val="Hipervnculo"/>
@@ -2569,7 +2490,7 @@
                 <w:noProof/>
                 <w:webHidden/>
               </w:rPr>
-              <w:instrText xml:space="preserve"> PAGEREF _Toc201851632 \h </w:instrText>
+              <w:instrText xml:space="preserve"> PAGEREF _Toc202852151 \h </w:instrText>
             </w:r>
             <w:r>
               <w:rPr>
@@ -2611,7 +2532,7 @@
               <w:lang w:eastAsia="es-MX"/>
             </w:rPr>
           </w:pPr>
-          <w:hyperlink w:anchor="_Toc201851633" w:history="1">
+          <w:hyperlink w:anchor="_Toc202852152" w:history="1">
             <w:r>
               <w:rPr>
                 <w:rStyle w:val="Hipervnculo"/>
@@ -2638,7 +2559,7 @@
                 <w:noProof/>
                 <w:webHidden/>
               </w:rPr>
-              <w:instrText xml:space="preserve"> PAGEREF _Toc201851633 \h </w:instrText>
+              <w:instrText xml:space="preserve"> PAGEREF _Toc202852152 \h </w:instrText>
             </w:r>
             <w:r>
               <w:rPr>
@@ -2683,7 +2604,7 @@
               <w:lang w:eastAsia="es-MX"/>
             </w:rPr>
           </w:pPr>
-          <w:hyperlink w:anchor="_Toc201851634" w:history="1">
+          <w:hyperlink w:anchor="_Toc202852153" w:history="1">
             <w:r>
               <w:rPr>
                 <w:rStyle w:val="Hipervnculo"/>
@@ -2710,7 +2631,7 @@
                 <w:noProof/>
                 <w:webHidden/>
               </w:rPr>
-              <w:instrText xml:space="preserve"> PAGEREF _Toc201851634 \h </w:instrText>
+              <w:instrText xml:space="preserve"> PAGEREF _Toc202852153 \h </w:instrText>
             </w:r>
             <w:r>
               <w:rPr>
@@ -2755,7 +2676,7 @@
               <w:lang w:eastAsia="es-MX"/>
             </w:rPr>
           </w:pPr>
-          <w:hyperlink w:anchor="_Toc201851635" w:history="1">
+          <w:hyperlink w:anchor="_Toc202852154" w:history="1">
             <w:r>
               <w:rPr>
                 <w:rStyle w:val="Hipervnculo"/>
@@ -2782,7 +2703,7 @@
                 <w:noProof/>
                 <w:webHidden/>
               </w:rPr>
-              <w:instrText xml:space="preserve"> PAGEREF _Toc201851635 \h </w:instrText>
+              <w:instrText xml:space="preserve"> PAGEREF _Toc202852154 \h </w:instrText>
             </w:r>
             <w:r>
               <w:rPr>
@@ -2827,7 +2748,7 @@
               <w:lang w:eastAsia="es-MX"/>
             </w:rPr>
           </w:pPr>
-          <w:hyperlink w:anchor="_Toc201851636" w:history="1">
+          <w:hyperlink w:anchor="_Toc202852155" w:history="1">
             <w:r>
               <w:rPr>
                 <w:rStyle w:val="Hipervnculo"/>
@@ -2855,7 +2776,7 @@
                 <w:noProof/>
                 <w:webHidden/>
               </w:rPr>
-              <w:instrText xml:space="preserve"> PAGEREF _Toc201851636 \h </w:instrText>
+              <w:instrText xml:space="preserve"> PAGEREF _Toc202852155 \h </w:instrText>
             </w:r>
             <w:r>
               <w:rPr>
@@ -2900,7 +2821,7 @@
               <w:lang w:eastAsia="es-MX"/>
             </w:rPr>
           </w:pPr>
-          <w:hyperlink w:anchor="_Toc201851637" w:history="1">
+          <w:hyperlink w:anchor="_Toc202852156" w:history="1">
             <w:r>
               <w:rPr>
                 <w:rStyle w:val="Hipervnculo"/>
@@ -2927,7 +2848,7 @@
                 <w:noProof/>
                 <w:webHidden/>
               </w:rPr>
-              <w:instrText xml:space="preserve"> PAGEREF _Toc201851637 \h </w:instrText>
+              <w:instrText xml:space="preserve"> PAGEREF _Toc202852156 \h </w:instrText>
             </w:r>
             <w:r>
               <w:rPr>
@@ -2992,7 +2913,7 @@
       <w:pPr>
         <w:pStyle w:val="Titulosgenerales"/>
       </w:pPr>
-      <w:bookmarkStart w:id="0" w:name="_Toc201851607"/>
+      <w:bookmarkStart w:id="0" w:name="_Toc202852126"/>
       <w:r>
         <w:lastRenderedPageBreak/>
         <w:t>Introducción</w:t>
@@ -3157,7 +3078,21 @@
                 <w:bCs/>
                 <w:lang w:val="es-419"/>
               </w:rPr>
-              <w:t>funcionamiento del bloque motor: cilindros y alojamientos de pistones.</w:t>
+              <w:t>F</w:t>
+            </w:r>
+            <w:r>
+              <w:rPr>
+                <w:bCs/>
+                <w:lang w:val="es-419"/>
+              </w:rPr>
+              <w:t>u</w:t>
+            </w:r>
+            <w:r>
+              <w:rPr>
+                <w:bCs/>
+                <w:lang w:val="es-419"/>
+              </w:rPr>
+              <w:t>ncionamiento del bloque motor: cilindros y alojamientos de pistones.</w:t>
             </w:r>
           </w:p>
         </w:tc>
@@ -3263,7 +3198,7 @@
           <w:numId w:val="5"/>
         </w:numPr>
       </w:pPr>
-      <w:bookmarkStart w:id="1" w:name="_Toc201851608"/>
+      <w:bookmarkStart w:id="1" w:name="_Toc202852127"/>
       <w:r>
         <w:lastRenderedPageBreak/>
         <w:t>E</w:t>
@@ -3287,7 +3222,7 @@
       <w:pPr>
         <w:pStyle w:val="Ttulo2"/>
       </w:pPr>
-      <w:bookmarkStart w:id="2" w:name="_Toc201851609"/>
+      <w:bookmarkStart w:id="2" w:name="_Toc202852128"/>
       <w:r>
         <w:t xml:space="preserve">1.1 </w:t>
       </w:r>
@@ -3571,7 +3506,7 @@
       <w:pPr>
         <w:pStyle w:val="Ttulo2"/>
       </w:pPr>
-      <w:bookmarkStart w:id="3" w:name="_Toc201851610"/>
+      <w:bookmarkStart w:id="3" w:name="_Toc202852129"/>
       <w:r>
         <w:t xml:space="preserve">1.2 </w:t>
       </w:r>
@@ -4447,7 +4382,7 @@
         <w:pStyle w:val="Ttulo2"/>
         <w:ind w:left="0" w:firstLine="0"/>
       </w:pPr>
-      <w:bookmarkStart w:id="4" w:name="_Toc201851611"/>
+      <w:bookmarkStart w:id="4" w:name="_Toc202852130"/>
       <w:r>
         <w:t xml:space="preserve">1.3 </w:t>
       </w:r>
@@ -4790,7 +4725,7 @@
           <w:numId w:val="5"/>
         </w:numPr>
       </w:pPr>
-      <w:bookmarkStart w:id="5" w:name="_Toc201851612"/>
+      <w:bookmarkStart w:id="5" w:name="_Toc202852131"/>
       <w:r>
         <w:lastRenderedPageBreak/>
         <w:t>Camisas de cilindros</w:t>
@@ -4814,7 +4749,7 @@
       <w:pPr>
         <w:pStyle w:val="Ttulo2"/>
       </w:pPr>
-      <w:bookmarkStart w:id="6" w:name="_Toc201851613"/>
+      <w:bookmarkStart w:id="6" w:name="_Toc202852132"/>
       <w:r>
         <w:t>2.1</w:t>
       </w:r>
@@ -4828,12 +4763,9 @@
         <w:t>.</w:t>
       </w:r>
       <w:r>
-        <w:t xml:space="preserve"> Tipos de camisas de cilindro.</w:t>
+        <w:t xml:space="preserve"> Tipos de camisas de cilindro</w:t>
       </w:r>
       <w:bookmarkEnd w:id="6"/>
-      <w:r>
-        <w:t xml:space="preserve"> </w:t>
-      </w:r>
     </w:p>
     <w:p>
       <w:pPr>
@@ -4854,7 +4786,7 @@
       <w:pPr>
         <w:pStyle w:val="Ttulo3"/>
       </w:pPr>
-      <w:bookmarkStart w:id="7" w:name="_Toc201851614"/>
+      <w:bookmarkStart w:id="7" w:name="_Toc202852133"/>
       <w:r>
         <w:t>2.1.1. Camisas secas: características y aplicaciones</w:t>
       </w:r>
@@ -5062,9 +4994,9 @@
           <w:lang w:val="es-419" w:eastAsia="es-CO"/>
         </w:rPr>
         <w:drawing>
-          <wp:inline distT="0" distB="0" distL="0" distR="0" wp14:anchorId="6DCBFCF7" wp14:editId="0D6C08FF">
-            <wp:extent cx="6332220" cy="2516505"/>
-            <wp:effectExtent l="0" t="0" r="5080" b="0"/>
+          <wp:inline distT="0" distB="0" distL="0" distR="0" wp14:anchorId="6DCBFCF7" wp14:editId="496A74D3">
+            <wp:extent cx="5645889" cy="2516505"/>
+            <wp:effectExtent l="0" t="0" r="5715" b="0"/>
             <wp:docPr id="135698970" name="Imagen 1" descr="La figura 4 ilustra un corte transversal de bloque con camisa seca y se enuncian sus partes: cámara de agua, camisa seca y metal entre la camisa de y la cámara de agua."/>
             <wp:cNvGraphicFramePr>
               <a:graphicFrameLocks xmlns:a="http://schemas.openxmlformats.org/drawingml/2006/main" noChangeAspect="1"/>
@@ -5085,7 +5017,7 @@
                   <pic:spPr>
                     <a:xfrm>
                       <a:off x="0" y="0"/>
-                      <a:ext cx="6332220" cy="2516505"/>
+                      <a:ext cx="5653189" cy="2519759"/>
                     </a:xfrm>
                     <a:prstGeom prst="rect">
                       <a:avLst/>
@@ -5145,9 +5077,12 @@
       <w:pPr>
         <w:pStyle w:val="Ttulo3"/>
       </w:pPr>
-      <w:bookmarkStart w:id="8" w:name="_Toc201851615"/>
-      <w:r>
-        <w:t>2.1.2. Camisas húmedas: ventajas y desventajas</w:t>
+      <w:bookmarkStart w:id="8" w:name="_Toc202852134"/>
+      <w:r>
+        <w:t xml:space="preserve">2.1.2. Camisas húmedas: </w:t>
+      </w:r>
+      <w:r>
+        <w:t>características y aplicaciones</w:t>
       </w:r>
       <w:bookmarkEnd w:id="8"/>
     </w:p>
@@ -5277,9 +5212,9 @@
           <w:lang w:val="es-419" w:eastAsia="es-CO"/>
         </w:rPr>
         <w:drawing>
-          <wp:inline distT="0" distB="0" distL="0" distR="0" wp14:anchorId="0A9D4014" wp14:editId="1153F31D">
-            <wp:extent cx="6332220" cy="2682875"/>
-            <wp:effectExtent l="0" t="0" r="5080" b="0"/>
+          <wp:inline distT="0" distB="0" distL="0" distR="0" wp14:anchorId="0A9D4014" wp14:editId="07FF1563">
+            <wp:extent cx="5752214" cy="2682875"/>
+            <wp:effectExtent l="0" t="0" r="0" b="0"/>
             <wp:docPr id="1164728343" name="Imagen 1" descr="Se ilustra un corte de bloque con camisa húmeda y la circulación del refrigerante en su interior."/>
             <wp:cNvGraphicFramePr>
               <a:graphicFrameLocks xmlns:a="http://schemas.openxmlformats.org/drawingml/2006/main" noChangeAspect="1"/>
@@ -5300,7 +5235,7 @@
                   <pic:spPr>
                     <a:xfrm>
                       <a:off x="0" y="0"/>
-                      <a:ext cx="6332220" cy="2682875"/>
+                      <a:ext cx="5759216" cy="2686141"/>
                     </a:xfrm>
                     <a:prstGeom prst="rect">
                       <a:avLst/>
@@ -5403,6 +5338,7 @@
       <w:tr>
         <w:trPr>
           <w:cnfStyle w:val="100000000000" w:firstRow="1" w:lastRow="0" w:firstColumn="0" w:lastColumn="0" w:oddVBand="0" w:evenVBand="0" w:oddHBand="0" w:evenHBand="0" w:firstRowFirstColumn="0" w:firstRowLastColumn="0" w:lastRowFirstColumn="0" w:lastRowLastColumn="0"/>
+          <w:tblHeader/>
         </w:trPr>
         <w:tc>
           <w:tcPr>
@@ -6025,7 +5961,7 @@
       <w:pPr>
         <w:pStyle w:val="Ttulo2"/>
       </w:pPr>
-      <w:bookmarkStart w:id="9" w:name="_Toc201851616"/>
+      <w:bookmarkStart w:id="9" w:name="_Toc202852135"/>
       <w:r>
         <w:t>2.2. Métodos de inspección y mantenimiento de camisas de cilindro</w:t>
       </w:r>
@@ -6150,7 +6086,6 @@
           <w:bCs/>
           <w:szCs w:val="28"/>
         </w:rPr>
-        <w:lastRenderedPageBreak/>
         <w:t>Medición dimensional</w:t>
       </w:r>
     </w:p>
@@ -6444,7 +6379,7 @@
           <w:numId w:val="5"/>
         </w:numPr>
       </w:pPr>
-      <w:bookmarkStart w:id="10" w:name="_Toc201851617"/>
+      <w:bookmarkStart w:id="10" w:name="_Toc202852136"/>
       <w:r>
         <w:lastRenderedPageBreak/>
         <w:t>Procesos de rectificación en motores</w:t>
@@ -6459,7 +6394,7 @@
           <w:szCs w:val="32"/>
         </w:rPr>
       </w:pPr>
-      <w:bookmarkStart w:id="11" w:name="_Toc201851618"/>
+      <w:bookmarkStart w:id="11" w:name="_Toc202852137"/>
       <w:r>
         <w:rPr>
           <w:sz w:val="32"/>
@@ -6678,12 +6613,13 @@
       </w:pPr>
       <w:r>
         <w:rPr>
+          <w:noProof/>
           <w:lang w:val="es-ES" w:eastAsia="es-CO"/>
         </w:rPr>
         <w:drawing>
-          <wp:inline distT="0" distB="0" distL="0" distR="0" wp14:anchorId="2F22BAAC" wp14:editId="0319492D">
-            <wp:extent cx="6332220" cy="2803525"/>
-            <wp:effectExtent l="0" t="0" r="5080" b="3175"/>
+          <wp:inline distT="0" distB="0" distL="0" distR="0" wp14:anchorId="2F22BAAC" wp14:editId="0B6E1977">
+            <wp:extent cx="5752214" cy="2803525"/>
+            <wp:effectExtent l="0" t="0" r="1270" b="3175"/>
             <wp:docPr id="1411139367" name="Imagen 1" descr="La figura 6 muestra el análisis de desgaste y deformaciones en cilindros y sus parámetros críticos para rectificación."/>
             <wp:cNvGraphicFramePr>
               <a:graphicFrameLocks xmlns:a="http://schemas.openxmlformats.org/drawingml/2006/main" noChangeAspect="1"/>
@@ -6704,7 +6640,7 @@
                   <pic:spPr>
                     <a:xfrm>
                       <a:off x="0" y="0"/>
-                      <a:ext cx="6332220" cy="2803525"/>
+                      <a:ext cx="5764873" cy="2809695"/>
                     </a:xfrm>
                     <a:prstGeom prst="rect">
                       <a:avLst/>
@@ -6763,7 +6699,7 @@
           <w:szCs w:val="32"/>
         </w:rPr>
       </w:pPr>
-      <w:bookmarkStart w:id="12" w:name="_Toc201851619"/>
+      <w:bookmarkStart w:id="12" w:name="_Toc202852138"/>
       <w:r>
         <w:rPr>
           <w:sz w:val="32"/>
@@ -6870,7 +6806,7 @@
           <w:szCs w:val="32"/>
         </w:rPr>
       </w:pPr>
-      <w:bookmarkStart w:id="13" w:name="_Toc201851620"/>
+      <w:bookmarkStart w:id="13" w:name="_Toc202852139"/>
       <w:r>
         <w:rPr>
           <w:sz w:val="32"/>
@@ -6897,7 +6833,7 @@
       <w:pPr>
         <w:pStyle w:val="Ttulo3"/>
       </w:pPr>
-      <w:bookmarkStart w:id="14" w:name="_Toc201851621"/>
+      <w:bookmarkStart w:id="14" w:name="_Toc202852140"/>
       <w:r>
         <w:t>3.3.1. Desmontaje y evaluación inicial</w:t>
       </w:r>
@@ -7139,7 +7075,7 @@
       <w:pPr>
         <w:pStyle w:val="Ttulo3"/>
       </w:pPr>
-      <w:bookmarkStart w:id="15" w:name="_Toc201851622"/>
+      <w:bookmarkStart w:id="15" w:name="_Toc202852141"/>
       <w:r>
         <w:t>3.3.2. Medición y análisis de desgaste:</w:t>
       </w:r>
@@ -7371,7 +7307,7 @@
       <w:pPr>
         <w:pStyle w:val="Ttulo3"/>
       </w:pPr>
-      <w:bookmarkStart w:id="16" w:name="_Toc201851623"/>
+      <w:bookmarkStart w:id="16" w:name="_Toc202852142"/>
       <w:r>
         <w:t>3.3.3. Técnicas de rectificación y reacondicionamiento:</w:t>
       </w:r>
@@ -7599,9 +7535,18 @@
       <w:r>
         <w:rPr>
           <w:rFonts w:ascii="Calibri" w:hAnsi="Calibri" w:cs="Calibri"/>
-          <w:szCs w:val="28"/>
-        </w:rPr>
-        <w:t>Inspección del motor: se desmonta y evalúa el desgaste de sus componentes.</w:t>
+          <w:b/>
+          <w:bCs/>
+          <w:szCs w:val="28"/>
+        </w:rPr>
+        <w:t>Inspección del motor:</w:t>
+      </w:r>
+      <w:r>
+        <w:rPr>
+          <w:rFonts w:ascii="Calibri" w:hAnsi="Calibri" w:cs="Calibri"/>
+          <w:szCs w:val="28"/>
+        </w:rPr>
+        <w:t xml:space="preserve"> se desmonta y evalúa el desgaste de sus componentes.</w:t>
       </w:r>
     </w:p>
     <w:p>
@@ -7620,6 +7565,8 @@
       <w:r>
         <w:rPr>
           <w:rFonts w:ascii="Calibri" w:hAnsi="Calibri" w:cs="Calibri"/>
+          <w:b/>
+          <w:bCs/>
           <w:szCs w:val="28"/>
         </w:rPr>
         <w:t xml:space="preserve">Rectificación de </w:t>
@@ -7627,6 +7574,8 @@
       <w:r>
         <w:rPr>
           <w:rFonts w:ascii="Calibri" w:hAnsi="Calibri" w:cs="Calibri"/>
+          <w:b/>
+          <w:bCs/>
           <w:szCs w:val="28"/>
         </w:rPr>
         <w:t>c</w:t>
@@ -7634,6 +7583,8 @@
       <w:r>
         <w:rPr>
           <w:rFonts w:ascii="Calibri" w:hAnsi="Calibri" w:cs="Calibri"/>
+          <w:b/>
+          <w:bCs/>
           <w:szCs w:val="28"/>
         </w:rPr>
         <w:t>ilindros</w:t>
@@ -7670,6 +7621,8 @@
       <w:r>
         <w:rPr>
           <w:rFonts w:ascii="Calibri" w:hAnsi="Calibri" w:cs="Calibri"/>
+          <w:b/>
+          <w:bCs/>
           <w:szCs w:val="28"/>
         </w:rPr>
         <w:t>Alesado</w:t>
@@ -7678,9 +7631,18 @@
       <w:r>
         <w:rPr>
           <w:rFonts w:ascii="Calibri" w:hAnsi="Calibri" w:cs="Calibri"/>
-          <w:szCs w:val="28"/>
-        </w:rPr>
-        <w:t xml:space="preserve">: </w:t>
+          <w:b/>
+          <w:bCs/>
+          <w:szCs w:val="28"/>
+        </w:rPr>
+        <w:t>:</w:t>
+      </w:r>
+      <w:r>
+        <w:rPr>
+          <w:rFonts w:ascii="Calibri" w:hAnsi="Calibri" w:cs="Calibri"/>
+          <w:szCs w:val="28"/>
+        </w:rPr>
+        <w:t xml:space="preserve"> </w:t>
       </w:r>
       <w:r>
         <w:rPr>
@@ -7713,9 +7675,18 @@
       <w:r>
         <w:rPr>
           <w:rFonts w:ascii="Calibri" w:hAnsi="Calibri" w:cs="Calibri"/>
-          <w:szCs w:val="28"/>
-        </w:rPr>
-        <w:t xml:space="preserve">Bruñido: </w:t>
+          <w:b/>
+          <w:bCs/>
+          <w:szCs w:val="28"/>
+        </w:rPr>
+        <w:t>Bruñido:</w:t>
+      </w:r>
+      <w:r>
+        <w:rPr>
+          <w:rFonts w:ascii="Calibri" w:hAnsi="Calibri" w:cs="Calibri"/>
+          <w:szCs w:val="28"/>
+        </w:rPr>
+        <w:t xml:space="preserve"> </w:t>
       </w:r>
       <w:r>
         <w:rPr>
@@ -7748,9 +7719,18 @@
       <w:r>
         <w:rPr>
           <w:rFonts w:ascii="Calibri" w:hAnsi="Calibri" w:cs="Calibri"/>
-          <w:szCs w:val="28"/>
-        </w:rPr>
-        <w:t xml:space="preserve">Medición final: </w:t>
+          <w:b/>
+          <w:bCs/>
+          <w:szCs w:val="28"/>
+        </w:rPr>
+        <w:t>Medición final:</w:t>
+      </w:r>
+      <w:r>
+        <w:rPr>
+          <w:rFonts w:ascii="Calibri" w:hAnsi="Calibri" w:cs="Calibri"/>
+          <w:szCs w:val="28"/>
+        </w:rPr>
+        <w:t xml:space="preserve"> </w:t>
       </w:r>
       <w:r>
         <w:rPr>
@@ -7783,16 +7763,18 @@
       <w:r>
         <w:rPr>
           <w:rFonts w:ascii="Calibri" w:hAnsi="Calibri" w:cs="Calibri"/>
-          <w:szCs w:val="28"/>
-        </w:rPr>
-        <w:t>Rectificación del cigüeñal</w:t>
-      </w:r>
-      <w:r>
-        <w:rPr>
-          <w:rFonts w:ascii="Calibri" w:hAnsi="Calibri" w:cs="Calibri"/>
-          <w:szCs w:val="28"/>
-        </w:rPr>
-        <w:t>: m</w:t>
+          <w:b/>
+          <w:bCs/>
+          <w:szCs w:val="28"/>
+        </w:rPr>
+        <w:t>Rectificación del cigüeñal:</w:t>
+      </w:r>
+      <w:r>
+        <w:rPr>
+          <w:rFonts w:ascii="Calibri" w:hAnsi="Calibri" w:cs="Calibri"/>
+          <w:szCs w:val="28"/>
+        </w:rPr>
+        <w:t xml:space="preserve"> m</w:t>
       </w:r>
       <w:r>
         <w:rPr>
@@ -7818,16 +7800,18 @@
       <w:r>
         <w:rPr>
           <w:rFonts w:ascii="Calibri" w:hAnsi="Calibri" w:cs="Calibri"/>
-          <w:szCs w:val="28"/>
-        </w:rPr>
-        <w:t>Rectificación de la culata</w:t>
-      </w:r>
-      <w:r>
-        <w:rPr>
-          <w:rFonts w:ascii="Calibri" w:hAnsi="Calibri" w:cs="Calibri"/>
-          <w:szCs w:val="28"/>
-        </w:rPr>
-        <w:t xml:space="preserve">: </w:t>
+          <w:b/>
+          <w:bCs/>
+          <w:szCs w:val="28"/>
+        </w:rPr>
+        <w:t>Rectificación de la culata:</w:t>
+      </w:r>
+      <w:r>
+        <w:rPr>
+          <w:rFonts w:ascii="Calibri" w:hAnsi="Calibri" w:cs="Calibri"/>
+          <w:szCs w:val="28"/>
+        </w:rPr>
+        <w:t xml:space="preserve"> </w:t>
       </w:r>
       <w:r>
         <w:rPr>
@@ -7860,16 +7844,18 @@
       <w:r>
         <w:rPr>
           <w:rFonts w:ascii="Calibri" w:hAnsi="Calibri" w:cs="Calibri"/>
-          <w:szCs w:val="28"/>
-        </w:rPr>
-        <w:t>Montaje y ajuste</w:t>
-      </w:r>
-      <w:r>
-        <w:rPr>
-          <w:rFonts w:ascii="Calibri" w:hAnsi="Calibri" w:cs="Calibri"/>
-          <w:szCs w:val="28"/>
-        </w:rPr>
-        <w:t>: e</w:t>
+          <w:b/>
+          <w:bCs/>
+          <w:szCs w:val="28"/>
+        </w:rPr>
+        <w:t xml:space="preserve">Montaje y ajuste: </w:t>
+      </w:r>
+      <w:r>
+        <w:rPr>
+          <w:rFonts w:ascii="Calibri" w:hAnsi="Calibri" w:cs="Calibri"/>
+          <w:szCs w:val="28"/>
+        </w:rPr>
+        <w:t>e</w:t>
       </w:r>
       <w:r>
         <w:rPr>
@@ -7895,16 +7881,18 @@
       <w:r>
         <w:rPr>
           <w:rFonts w:ascii="Calibri" w:hAnsi="Calibri" w:cs="Calibri"/>
-          <w:szCs w:val="28"/>
-        </w:rPr>
-        <w:t>Prueba fina</w:t>
-      </w:r>
-      <w:r>
-        <w:rPr>
-          <w:rFonts w:ascii="Calibri" w:hAnsi="Calibri" w:cs="Calibri"/>
-          <w:szCs w:val="28"/>
-        </w:rPr>
-        <w:t xml:space="preserve">l: </w:t>
+          <w:b/>
+          <w:bCs/>
+          <w:szCs w:val="28"/>
+        </w:rPr>
+        <w:t>Prueba final:</w:t>
+      </w:r>
+      <w:r>
+        <w:rPr>
+          <w:rFonts w:ascii="Calibri" w:hAnsi="Calibri" w:cs="Calibri"/>
+          <w:szCs w:val="28"/>
+        </w:rPr>
+        <w:t xml:space="preserve"> </w:t>
       </w:r>
       <w:r>
         <w:rPr>
@@ -8167,7 +8155,7 @@
           <w:lang w:val="es-CO"/>
         </w:rPr>
       </w:pPr>
-      <w:bookmarkStart w:id="17" w:name="_Toc201851624"/>
+      <w:bookmarkStart w:id="17" w:name="_Toc202852143"/>
       <w:r>
         <w:rPr>
           <w:rFonts w:ascii="Calibri" w:hAnsi="Calibri" w:cs="Calibri"/>
@@ -8200,7 +8188,7 @@
           <w:lang w:val="es-ES"/>
         </w:rPr>
       </w:pPr>
-      <w:bookmarkStart w:id="18" w:name="_Toc201851625"/>
+      <w:bookmarkStart w:id="18" w:name="_Toc202852144"/>
       <w:r>
         <w:t xml:space="preserve">4.1. </w:t>
       </w:r>
@@ -9465,7 +9453,7 @@
       <w:pPr>
         <w:pStyle w:val="Ttulo2"/>
       </w:pPr>
-      <w:bookmarkStart w:id="19" w:name="_Toc201851626"/>
+      <w:bookmarkStart w:id="19" w:name="_Toc202852145"/>
       <w:r>
         <w:t>4.2. Proceso de ensamblaje de pistones y bielas</w:t>
       </w:r>
@@ -9724,7 +9712,7 @@
       <w:pPr>
         <w:pStyle w:val="Ttulo2"/>
       </w:pPr>
-      <w:bookmarkStart w:id="20" w:name="_Toc201851627"/>
+      <w:bookmarkStart w:id="20" w:name="_Toc202852146"/>
       <w:r>
         <w:t>4.3. Métodos de instalación y ajuste de pistones</w:t>
       </w:r>
@@ -10015,7 +10003,7 @@
       <w:pPr>
         <w:pStyle w:val="Ttulo2"/>
       </w:pPr>
-      <w:bookmarkStart w:id="21" w:name="_Toc201851628"/>
+      <w:bookmarkStart w:id="21" w:name="_Toc202852147"/>
       <w:r>
         <w:t>4.4. Pruebas de verificación del ensamblaje</w:t>
       </w:r>
@@ -10218,7 +10206,7 @@
           <w:lang w:val="es-ES"/>
         </w:rPr>
       </w:pPr>
-      <w:bookmarkStart w:id="22" w:name="_Toc201851629"/>
+      <w:bookmarkStart w:id="22" w:name="_Toc202852148"/>
       <w:r>
         <w:rPr>
           <w:rFonts w:ascii="Calibri" w:hAnsi="Calibri" w:cs="Calibri"/>
@@ -10718,7 +10706,7 @@
       <w:pPr>
         <w:pStyle w:val="Ttulo2"/>
       </w:pPr>
-      <w:bookmarkStart w:id="23" w:name="_Toc201851630"/>
+      <w:bookmarkStart w:id="23" w:name="_Toc202852149"/>
       <w:r>
         <w:t>5.1. Función y tipos de ejes de levas</w:t>
       </w:r>
@@ -10968,9 +10956,9 @@
           <w:lang w:eastAsia="es-CO"/>
         </w:rPr>
         <w:drawing>
-          <wp:inline distT="0" distB="0" distL="0" distR="0" wp14:anchorId="0DEE4D8C" wp14:editId="440CE1F7">
-            <wp:extent cx="6332220" cy="3860800"/>
-            <wp:effectExtent l="0" t="0" r="5080" b="0"/>
+          <wp:inline distT="0" distB="0" distL="0" distR="0" wp14:anchorId="0DEE4D8C" wp14:editId="3C82194E">
+            <wp:extent cx="5645889" cy="3860800"/>
+            <wp:effectExtent l="0" t="0" r="5715" b="0"/>
             <wp:docPr id="1842765272" name="Imagen 1" descr="La figura 13 ilustra el esquema comparativo de configuraciones OHV y OHC."/>
             <wp:cNvGraphicFramePr>
               <a:graphicFrameLocks xmlns:a="http://schemas.openxmlformats.org/drawingml/2006/main" noChangeAspect="1"/>
@@ -10991,7 +10979,7 @@
                   <pic:spPr>
                     <a:xfrm>
                       <a:off x="0" y="0"/>
-                      <a:ext cx="6332220" cy="3860800"/>
+                      <a:ext cx="5655184" cy="3867156"/>
                     </a:xfrm>
                     <a:prstGeom prst="rect">
                       <a:avLst/>
@@ -11051,7 +11039,7 @@
       <w:pPr>
         <w:pStyle w:val="Ttulo2"/>
       </w:pPr>
-      <w:bookmarkStart w:id="24" w:name="_Toc201851631"/>
+      <w:bookmarkStart w:id="24" w:name="_Toc202852150"/>
       <w:r>
         <w:t>5.2. Procedimiento para el montaje del eje de levas</w:t>
       </w:r>
@@ -11370,7 +11358,7 @@
       <w:pPr>
         <w:pStyle w:val="Ttulo2"/>
       </w:pPr>
-      <w:bookmarkStart w:id="25" w:name="_Toc201851632"/>
+      <w:bookmarkStart w:id="25" w:name="_Toc202852151"/>
       <w:r>
         <w:t>5.3. Ajuste y calibración del eje de levas</w:t>
       </w:r>
@@ -11509,7 +11497,7 @@
       <w:r>
         <w:t xml:space="preserve"> </w:t>
       </w:r>
-      <w:bookmarkStart w:id="26" w:name="_Toc201851633"/>
+      <w:bookmarkStart w:id="26" w:name="_Toc202852152"/>
       <w:r>
         <w:t>5.4. Diagnóstico y corrección de fallas en el eje de levas</w:t>
       </w:r>
@@ -11735,7 +11723,7 @@
         </w:rPr>
         <w:lastRenderedPageBreak/>
         <w:drawing>
-          <wp:anchor distT="0" distB="0" distL="114300" distR="114300" simplePos="0" relativeHeight="251684864" behindDoc="1" locked="0" layoutInCell="1" allowOverlap="1" wp14:anchorId="3D5D9EAC" wp14:editId="25B2391C">
+          <wp:anchor distT="0" distB="0" distL="114300" distR="114300" simplePos="0" relativeHeight="251684864" behindDoc="1" locked="0" layoutInCell="1" allowOverlap="1" wp14:anchorId="3D5D9EAC" wp14:editId="430EAB9D">
             <wp:simplePos x="0" y="0"/>
             <wp:positionH relativeFrom="column">
               <wp:posOffset>-21590</wp:posOffset>
@@ -11754,7 +11742,7 @@
                 <wp:lineTo x="0" y="0"/>
               </wp:wrapPolygon>
             </wp:wrapTight>
-            <wp:docPr id="1804326714" name="Imagen 1" descr="Diagrama de flujo que ilustra el funcionamiento del bloque motor: cilindros y alojamientos de pistones."/>
+            <wp:docPr id="1804326714" name="Imagen 1" descr="El componente formativo “Funcionamiento del bloque motor: cilindros y alojamientos de pistones”; ofrece una aproximación integral a la comprensión de los elementos críticos que determinan el rendimiento del motor. A lo largo del curso se estudian desde la definición y función del bloque de cilindros, pasando por las características de las camisas secas y húmedas, hasta los procesos de rectificación, ensamblaje de pistones y montaje del eje de levas. El contenido profundiza en el diagnóstico de fallas, los métodos de mantenimiento y las técnicas de ajuste y calibración, elementos esenciales para garantizar la eficiencia, durabilidad y seguridad del motor. Se enfatiza la importancia de cada etapa en la optimización de la combustión, la retención del aceite lubricante y la sincronización de las válvulas. Se sugiere desarrollar un mapa mental que resuma estos elementos, evidenciando la interrelación entre la estructura del motor y los procesos de mantenimiento y reparación, lo cual facilita una visión integral y práctica de los procedimientos y estándares aplicados en el ámbito automotriz."/>
             <wp:cNvGraphicFramePr>
               <a:graphicFrameLocks xmlns:a="http://schemas.openxmlformats.org/drawingml/2006/main" noChangeAspect="1"/>
             </wp:cNvGraphicFramePr>
@@ -11762,7 +11750,7 @@
               <a:graphicData uri="http://schemas.openxmlformats.org/drawingml/2006/picture">
                 <pic:pic xmlns:pic="http://schemas.openxmlformats.org/drawingml/2006/picture">
                   <pic:nvPicPr>
-                    <pic:cNvPr id="1804326714" name="Imagen 1" descr="Diagrama de flujo que ilustra el funcionamiento del bloque motor: cilindros y alojamientos de pistones."/>
+                    <pic:cNvPr id="1804326714" name="Imagen 1" descr="El componente formativo “Funcionamiento del bloque motor: cilindros y alojamientos de pistones”; ofrece una aproximación integral a la comprensión de los elementos críticos que determinan el rendimiento del motor. A lo largo del curso se estudian desde la definición y función del bloque de cilindros, pasando por las características de las camisas secas y húmedas, hasta los procesos de rectificación, ensamblaje de pistones y montaje del eje de levas. El contenido profundiza en el diagnóstico de fallas, los métodos de mantenimiento y las técnicas de ajuste y calibración, elementos esenciales para garantizar la eficiencia, durabilidad y seguridad del motor. Se enfatiza la importancia de cada etapa en la optimización de la combustión, la retención del aceite lubricante y la sincronización de las válvulas. Se sugiere desarrollar un mapa mental que resuma estos elementos, evidenciando la interrelación entre la estructura del motor y los procesos de mantenimiento y reparación, lo cual facilita una visión integral y práctica de los procedimientos y estándares aplicados en el ámbito automotriz."/>
                     <pic:cNvPicPr/>
                   </pic:nvPicPr>
                   <pic:blipFill>
@@ -11839,7 +11827,7 @@
       <w:pPr>
         <w:pStyle w:val="Titulosgenerales"/>
       </w:pPr>
-      <w:bookmarkStart w:id="27" w:name="_Toc201851634"/>
+      <w:bookmarkStart w:id="27" w:name="_Toc202852153"/>
       <w:r>
         <w:lastRenderedPageBreak/>
         <w:t>Glosario</w:t>
@@ -12343,7 +12331,7 @@
       <w:pPr>
         <w:pStyle w:val="Titulosgenerales"/>
       </w:pPr>
-      <w:bookmarkStart w:id="28" w:name="_Toc201851635"/>
+      <w:bookmarkStart w:id="28" w:name="_Toc202852154"/>
       <w:r>
         <w:lastRenderedPageBreak/>
         <w:t>Material complementario</w:t>
@@ -12906,7 +12894,7 @@
           <w:lang w:val="en-US"/>
         </w:rPr>
       </w:pPr>
-      <w:bookmarkStart w:id="29" w:name="_Toc201851636"/>
+      <w:bookmarkStart w:id="29" w:name="_Toc202852155"/>
       <w:proofErr w:type="spellStart"/>
       <w:r>
         <w:rPr>
@@ -13275,30 +13263,43 @@
           <w:rFonts w:eastAsia="Arial" w:cstheme="minorHAnsi"/>
           <w:kern w:val="0"/>
           <w:szCs w:val="28"/>
+          <w:lang w:val="en-US" w:eastAsia="ja-JP"/>
+          <w14:ligatures w14:val="none"/>
+        </w:rPr>
+      </w:pPr>
+      <w:r>
+        <w:rPr>
+          <w:rFonts w:ascii="Calibri" w:hAnsi="Calibri" w:cs="Calibri"/>
+          <w:b/>
+          <w:bCs/>
+          <w:szCs w:val="28"/>
+        </w:rPr>
+        <w:t>Redondo</w:t>
+      </w:r>
+      <w:r>
+        <w:rPr>
+          <w:rFonts w:eastAsia="Arial" w:cstheme="minorHAnsi"/>
+          <w:b/>
+          <w:bCs/>
+          <w:kern w:val="0"/>
+          <w:szCs w:val="28"/>
           <w:lang w:eastAsia="ja-JP"/>
           <w14:ligatures w14:val="none"/>
         </w:rPr>
-      </w:pPr>
-      <w:r>
-        <w:rPr>
-          <w:rFonts w:ascii="Calibri" w:hAnsi="Calibri" w:cs="Calibri"/>
-          <w:b/>
-          <w:bCs/>
-          <w:szCs w:val="28"/>
-        </w:rPr>
-        <w:t>Redondo</w:t>
+        <w:t>, L.</w:t>
       </w:r>
       <w:r>
         <w:rPr>
           <w:rFonts w:eastAsia="Arial" w:cstheme="minorHAnsi"/>
-          <w:b/>
-          <w:bCs/>
           <w:kern w:val="0"/>
           <w:szCs w:val="28"/>
           <w:lang w:eastAsia="ja-JP"/>
           <w14:ligatures w14:val="none"/>
         </w:rPr>
-        <w:t>, L.</w:t>
+        <w:t xml:space="preserve"> (2021). </w:t>
+      </w:r>
+      <w:r>
+        <w:t>Diseño y análisis de componentes críticos en motores: Pistones y bielas.</w:t>
       </w:r>
       <w:r>
         <w:rPr>
@@ -13308,47 +13309,43 @@
           <w:lang w:eastAsia="ja-JP"/>
           <w14:ligatures w14:val="none"/>
         </w:rPr>
-        <w:t xml:space="preserve"> (2021). </w:t>
-      </w:r>
-      <w:r>
-        <w:t>Diseño y análisis de componentes críticos en motores: Pistones y bielas.</w:t>
+        <w:t xml:space="preserve"> </w:t>
       </w:r>
       <w:r>
         <w:rPr>
           <w:rFonts w:eastAsia="Arial" w:cstheme="minorHAnsi"/>
           <w:kern w:val="0"/>
           <w:szCs w:val="28"/>
+          <w:lang w:val="en-US" w:eastAsia="ja-JP"/>
+          <w14:ligatures w14:val="none"/>
+        </w:rPr>
+        <w:t xml:space="preserve">Ingeniería Mecánica Aplicada, 15(3), 45-62. </w:t>
+      </w:r>
+    </w:p>
+    <w:p>
+      <w:pPr>
+        <w:rPr>
+          <w:rFonts w:eastAsia="Arial" w:cstheme="minorHAnsi"/>
+          <w:kern w:val="0"/>
+          <w:szCs w:val="28"/>
           <w:lang w:eastAsia="ja-JP"/>
           <w14:ligatures w14:val="none"/>
         </w:rPr>
-        <w:t xml:space="preserve"> Ingeniería Mecánica Aplicada, 15(3), 45-62. </w:t>
-      </w:r>
-    </w:p>
-    <w:p>
-      <w:pPr>
+      </w:pPr>
+      <w:r>
+        <w:rPr>
+          <w:rStyle w:val="Extranjerismo"/>
+          <w:b/>
+          <w:bCs/>
+        </w:rPr>
+        <w:t>SAE International</w:t>
+      </w:r>
+      <w:r>
         <w:rPr>
           <w:rFonts w:eastAsia="Arial" w:cstheme="minorHAnsi"/>
           <w:kern w:val="0"/>
           <w:szCs w:val="28"/>
-          <w:lang w:eastAsia="ja-JP"/>
-          <w14:ligatures w14:val="none"/>
-        </w:rPr>
-      </w:pPr>
-      <w:r>
-        <w:rPr>
-          <w:rStyle w:val="Extranjerismo"/>
-          <w:b/>
-          <w:bCs/>
-          <w:lang w:val="es-CO"/>
-        </w:rPr>
-        <w:t>SAE International</w:t>
-      </w:r>
-      <w:r>
-        <w:rPr>
-          <w:rFonts w:eastAsia="Arial" w:cstheme="minorHAnsi"/>
-          <w:kern w:val="0"/>
-          <w:szCs w:val="28"/>
-          <w:lang w:eastAsia="ja-JP"/>
+          <w:lang w:val="en-US" w:eastAsia="ja-JP"/>
           <w14:ligatures w14:val="none"/>
         </w:rPr>
         <w:t xml:space="preserve">. </w:t>
@@ -13481,7 +13478,7 @@
       <w:pPr>
         <w:pStyle w:val="Titulosgenerales"/>
       </w:pPr>
-      <w:bookmarkStart w:id="30" w:name="_Toc201851637"/>
+      <w:bookmarkStart w:id="30" w:name="_Toc202852156"/>
       <w:r>
         <w:lastRenderedPageBreak/>
         <w:t>Créditos</w:t>
@@ -20177,15 +20174,6 @@
 </file>
 
 <file path=customXml/item1.xml><?xml version="1.0" encoding="utf-8"?>
-<?mso-contentType ?>
-<FormTemplates xmlns="http://schemas.microsoft.com/sharepoint/v3/contenttype/forms">
-  <Display>DocumentLibraryForm</Display>
-  <Edit>DocumentLibraryForm</Edit>
-  <New>DocumentLibraryForm</New>
-</FormTemplates>
-</file>
-
-<file path=customXml/item2.xml><?xml version="1.0" encoding="utf-8"?>
 <ct:contentTypeSchema xmlns:ct="http://schemas.microsoft.com/office/2006/metadata/contentType" xmlns:ma="http://schemas.microsoft.com/office/2006/metadata/properties/metaAttributes" ct:_="" ma:_="" ma:contentTypeName="Documento" ma:contentTypeID="0x01010049282E1EDBE9234EA9E6D38F720E265F" ma:contentTypeVersion="15" ma:contentTypeDescription="Crear nuevo documento." ma:contentTypeScope="" ma:versionID="b31c7aa9eaf043a08b87120b3c4916e3">
   <xsd:schema xmlns:xsd="http://www.w3.org/2001/XMLSchema" xmlns:xs="http://www.w3.org/2001/XMLSchema" xmlns:p="http://schemas.microsoft.com/office/2006/metadata/properties" xmlns:ns2="cb45339b-ced9-4d0d-8f64-77573914d53b" xmlns:ns3="43a3ca16-9c26-4813-b83f-4aec9927b43f" targetNamespace="http://schemas.microsoft.com/office/2006/metadata/properties" ma:root="true" ma:fieldsID="3533d065b04d75c457075bc55f1f5315" ns2:_="" ns3:_="">
     <xsd:import namespace="cb45339b-ced9-4d0d-8f64-77573914d53b"/>
@@ -20420,7 +20408,20 @@
 </ct:contentTypeSchema>
 </file>
 
+<file path=customXml/item2.xml><?xml version="1.0" encoding="utf-8"?>
+<?mso-contentType ?>
+<FormTemplates xmlns="http://schemas.microsoft.com/sharepoint/v3/contenttype/forms">
+  <Display>DocumentLibraryForm</Display>
+  <Edit>DocumentLibraryForm</Edit>
+  <New>DocumentLibraryForm</New>
+</FormTemplates>
+</file>
+
 <file path=customXml/item3.xml><?xml version="1.0" encoding="utf-8"?>
+<b:Sources xmlns:b="http://schemas.openxmlformats.org/officeDocument/2006/bibliography" xmlns="http://schemas.openxmlformats.org/officeDocument/2006/bibliography" SelectedStyle="\APASixthEditionOfficeOnline.xsl" StyleName="APA" Version="6"/>
+</file>
+
+<file path=customXml/item4.xml><?xml version="1.0" encoding="utf-8"?>
 <p:properties xmlns:p="http://schemas.microsoft.com/office/2006/metadata/properties" xmlns:xsi="http://www.w3.org/2001/XMLSchema-instance" xmlns:pc="http://schemas.microsoft.com/office/infopath/2007/PartnerControls">
   <documentManagement>
     <TaxCatchAll xmlns="cb45339b-ced9-4d0d-8f64-77573914d53b" xsi:nil="true"/>
@@ -20431,19 +20432,7 @@
 </p:properties>
 </file>
 
-<file path=customXml/item4.xml><?xml version="1.0" encoding="utf-8"?>
-<b:Sources xmlns:b="http://schemas.openxmlformats.org/officeDocument/2006/bibliography" xmlns="http://schemas.openxmlformats.org/officeDocument/2006/bibliography" SelectedStyle="\APASixthEditionOfficeOnline.xsl" StyleName="APA" Version="6"/>
-</file>
-
 <file path=customXml/itemProps1.xml><?xml version="1.0" encoding="utf-8"?>
-<ds:datastoreItem xmlns:ds="http://schemas.openxmlformats.org/officeDocument/2006/customXml" ds:itemID="{81CBDEC1-3B00-44ED-AD36-0268077980BA}">
-  <ds:schemaRefs>
-    <ds:schemaRef ds:uri="http://schemas.microsoft.com/sharepoint/v3/contenttype/forms"/>
-  </ds:schemaRefs>
-</ds:datastoreItem>
-</file>
-
-<file path=customXml/itemProps2.xml><?xml version="1.0" encoding="utf-8"?>
 <ds:datastoreItem xmlns:ds="http://schemas.openxmlformats.org/officeDocument/2006/customXml" ds:itemID="{DF43E046-DB0C-42D1-8C73-AE38B52F1ED7}">
   <ds:schemaRefs>
     <ds:schemaRef ds:uri="http://schemas.microsoft.com/office/2006/metadata/contentType"/>
@@ -20462,7 +20451,23 @@
 </ds:datastoreItem>
 </file>
 
+<file path=customXml/itemProps2.xml><?xml version="1.0" encoding="utf-8"?>
+<ds:datastoreItem xmlns:ds="http://schemas.openxmlformats.org/officeDocument/2006/customXml" ds:itemID="{81CBDEC1-3B00-44ED-AD36-0268077980BA}">
+  <ds:schemaRefs>
+    <ds:schemaRef ds:uri="http://schemas.microsoft.com/sharepoint/v3/contenttype/forms"/>
+  </ds:schemaRefs>
+</ds:datastoreItem>
+</file>
+
 <file path=customXml/itemProps3.xml><?xml version="1.0" encoding="utf-8"?>
+<ds:datastoreItem xmlns:ds="http://schemas.openxmlformats.org/officeDocument/2006/customXml" ds:itemID="{E8AB44A3-7C62-4BD2-82ED-8ABC209970FA}">
+  <ds:schemaRefs>
+    <ds:schemaRef ds:uri="http://schemas.openxmlformats.org/officeDocument/2006/bibliography"/>
+  </ds:schemaRefs>
+</ds:datastoreItem>
+</file>
+
+<file path=customXml/itemProps4.xml><?xml version="1.0" encoding="utf-8"?>
 <ds:datastoreItem xmlns:ds="http://schemas.openxmlformats.org/officeDocument/2006/customXml" ds:itemID="{6929C9FE-9F22-4B98-96EF-1B541B3BD0B2}">
   <ds:schemaRefs>
     <ds:schemaRef ds:uri="http://schemas.microsoft.com/office/2006/metadata/properties"/>
@@ -20471,12 +20476,4 @@
     <ds:schemaRef ds:uri="43a3ca16-9c26-4813-b83f-4aec9927b43f"/>
   </ds:schemaRefs>
 </ds:datastoreItem>
-</file>
-
-<file path=customXml/itemProps4.xml><?xml version="1.0" encoding="utf-8"?>
-<ds:datastoreItem xmlns:ds="http://schemas.openxmlformats.org/officeDocument/2006/customXml" ds:itemID="{E8AB44A3-7C62-4BD2-82ED-8ABC209970FA}">
-  <ds:schemaRefs>
-    <ds:schemaRef ds:uri="http://schemas.openxmlformats.org/officeDocument/2006/bibliography"/>
-  </ds:schemaRefs>
-</ds:datastoreItem>
 </file>
</xml_diff>